<commit_message>
remove manuscript from github repo. it is in onedrive for better collaboration.  updated equations with \circ
</commit_message>
<xml_diff>
--- a/docs/equations/equations_docx.docx
+++ b/docs/equations/equations_docx.docx
@@ -4,10 +4,10 @@
   <w:body>
     <w:p>
       <w:pPr>
-        <w:jc w:val="right"/>
         <w:rPr>
-          <w:rFonts w:eastAsiaTheme="minorEastAsia"/>
+          <w:rFonts w:eastAsiaTheme="minorEastAsia" w:cstheme="minorHAnsi"/>
           <w:b/>
+          <w:bCs/>
           <w:color w:val="000000" w:themeColor="text1"/>
         </w:rPr>
       </w:pPr>
@@ -251,62 +251,6 @@
     </w:p>
     <w:p>
       <w:pPr>
-        <w:jc w:val="center"/>
-        <w:rPr>
-          <w:rFonts w:eastAsiaTheme="minorEastAsia"/>
-          <w:b/>
-          <w:color w:val="000000" w:themeColor="text1"/>
-        </w:rPr>
-      </w:pPr>
-      <m:oMathPara>
-        <m:oMath>
-          <m:sSub>
-            <m:sSubPr>
-              <m:ctrlPr>
-                <w:rPr>
-                  <w:rFonts w:ascii="Cambria Math" w:eastAsiaTheme="minorEastAsia" w:hAnsi="Cambria Math" w:cstheme="minorHAnsi"/>
-                  <w:i/>
-                  <w:color w:val="000000" w:themeColor="text1"/>
-                </w:rPr>
-              </m:ctrlPr>
-            </m:sSubPr>
-            <m:e>
-              <m:r>
-                <w:rPr>
-                  <w:rFonts w:ascii="Cambria Math" w:eastAsiaTheme="minorEastAsia" w:hAnsi="Cambria Math" w:cstheme="minorHAnsi"/>
-                  <w:color w:val="000000" w:themeColor="text1"/>
-                </w:rPr>
-                <m:t>0≤</m:t>
-              </m:r>
-              <m:r>
-                <m:rPr>
-                  <m:sty m:val="bi"/>
-                </m:rPr>
-                <w:rPr>
-                  <w:rFonts w:ascii="Cambria Math" w:eastAsiaTheme="minorEastAsia" w:hAnsi="Cambria Math" w:cstheme="minorHAnsi"/>
-                  <w:color w:val="000000" w:themeColor="text1"/>
-                </w:rPr>
-                <m:t>c</m:t>
-              </m:r>
-            </m:e>
-            <m:sub>
-              <m:r>
-                <m:rPr>
-                  <m:sty m:val="p"/>
-                </m:rPr>
-                <w:rPr>
-                  <w:rFonts w:ascii="Cambria Math" w:eastAsiaTheme="minorEastAsia" w:hAnsi="Cambria Math" w:cstheme="minorHAnsi"/>
-                  <w:color w:val="000000" w:themeColor="text1"/>
-                </w:rPr>
-                <m:t>SFA</m:t>
-              </m:r>
-            </m:sub>
-          </m:sSub>
-        </m:oMath>
-      </m:oMathPara>
-    </w:p>
-    <w:p>
-      <w:pPr>
         <w:jc w:val="right"/>
         <w:rPr>
           <w:rFonts w:eastAsiaTheme="minorEastAsia" w:cstheme="minorHAnsi"/>
@@ -323,9 +267,10 @@
     </w:p>
     <w:p>
       <w:pPr>
-        <w:jc w:val="right"/>
         <w:rPr>
           <w:rFonts w:eastAsiaTheme="minorEastAsia" w:cstheme="minorHAnsi"/>
+          <w:b/>
+          <w:bCs/>
           <w:color w:val="000000" w:themeColor="text1"/>
         </w:rPr>
       </w:pPr>
@@ -548,128 +493,8 @@
     </w:p>
     <w:p>
       <w:pPr>
-        <w:jc w:val="right"/>
         <w:rPr>
-          <w:rFonts w:eastAsiaTheme="minorEastAsia" w:cstheme="minorHAnsi"/>
-          <w:b/>
-          <w:color w:val="000000" w:themeColor="text1"/>
-        </w:rPr>
-      </w:pPr>
-      <m:oMathPara>
-        <m:oMath>
-          <m:r>
-            <m:rPr>
-              <m:sty m:val="bi"/>
-            </m:rPr>
-            <w:rPr>
-              <w:rFonts w:ascii="Cambria Math" w:eastAsiaTheme="minorEastAsia" w:hAnsi="Cambria Math" w:cstheme="minorHAnsi"/>
-              <w:color w:val="000000" w:themeColor="text1"/>
-            </w:rPr>
-            <m:t>p</m:t>
-          </m:r>
-          <m:r>
-            <w:rPr>
-              <w:rFonts w:ascii="Cambria Math" w:eastAsiaTheme="minorEastAsia" w:hAnsi="Cambria Math" w:cstheme="minorHAnsi"/>
-              <w:color w:val="000000" w:themeColor="text1"/>
-            </w:rPr>
-            <m:t xml:space="preserve">= </m:t>
-          </m:r>
-          <m:r>
-            <m:rPr>
-              <m:sty m:val="bi"/>
-            </m:rPr>
-            <w:rPr>
-              <w:rFonts w:ascii="Cambria Math" w:eastAsiaTheme="minorEastAsia" w:hAnsi="Cambria Math"/>
-              <w:color w:val="000000" w:themeColor="text1"/>
-            </w:rPr>
-            <m:t>r</m:t>
-          </m:r>
-          <m:nary>
-            <m:naryPr>
-              <m:chr m:val="∏"/>
-              <m:limLoc m:val="undOvr"/>
-              <m:supHide m:val="1"/>
-              <m:ctrlPr>
-                <w:rPr>
-                  <w:rFonts w:ascii="Cambria Math" w:eastAsiaTheme="minorEastAsia" w:hAnsi="Cambria Math"/>
-                  <w:b/>
-                  <w:i/>
-                  <w:color w:val="000000" w:themeColor="text1"/>
-                </w:rPr>
-              </m:ctrlPr>
-            </m:naryPr>
-            <m:sub>
-              <m:r>
-                <w:rPr>
-                  <w:rFonts w:ascii="Cambria Math" w:eastAsiaTheme="minorEastAsia" w:hAnsi="Cambria Math"/>
-                  <w:color w:val="000000" w:themeColor="text1"/>
-                </w:rPr>
-                <m:t>m</m:t>
-              </m:r>
-            </m:sub>
-            <m:sup/>
-            <m:e>
-              <m:sSub>
-                <m:sSubPr>
-                  <m:ctrlPr>
-                    <w:rPr>
-                      <w:rFonts w:ascii="Cambria Math" w:eastAsiaTheme="minorEastAsia" w:hAnsi="Cambria Math"/>
-                      <w:b/>
-                      <w:i/>
-                      <w:color w:val="000000" w:themeColor="text1"/>
-                    </w:rPr>
-                  </m:ctrlPr>
-                </m:sSubPr>
-                <m:e>
-                  <m:r>
-                    <m:rPr>
-                      <m:sty m:val="bi"/>
-                    </m:rPr>
-                    <w:rPr>
-                      <w:rFonts w:ascii="Cambria Math" w:eastAsiaTheme="minorEastAsia" w:hAnsi="Cambria Math"/>
-                      <w:color w:val="000000" w:themeColor="text1"/>
-                    </w:rPr>
-                    <m:t>b</m:t>
-                  </m:r>
-                </m:e>
-                <m:sub>
-                  <m:r>
-                    <w:rPr>
-                      <w:rFonts w:ascii="Cambria Math" w:eastAsiaTheme="minorEastAsia" w:hAnsi="Cambria Math"/>
-                      <w:color w:val="000000" w:themeColor="text1"/>
-                    </w:rPr>
-                    <m:t>m</m:t>
-                  </m:r>
-                </m:sub>
-              </m:sSub>
-            </m:e>
-          </m:nary>
-        </m:oMath>
-      </m:oMathPara>
-    </w:p>
-    <w:p>
-      <w:pPr>
-        <w:jc w:val="right"/>
-        <w:rPr>
-          <w:rFonts w:eastAsiaTheme="minorEastAsia" w:cstheme="minorHAnsi"/>
-          <w:bCs/>
-          <w:color w:val="000000" w:themeColor="text1"/>
-        </w:rPr>
-      </w:pPr>
-      <w:r>
-        <w:rPr>
-          <w:rFonts w:eastAsiaTheme="minorEastAsia" w:cstheme="minorHAnsi"/>
-          <w:bCs/>
-          <w:color w:val="000000" w:themeColor="text1"/>
-        </w:rPr>
-        <w:t>3</w:t>
-      </w:r>
-    </w:p>
-    <w:p>
-      <w:pPr>
-        <w:jc w:val="right"/>
-        <w:rPr>
-          <w:rFonts w:eastAsiaTheme="minorEastAsia" w:cstheme="minorHAnsi"/>
+          <w:rFonts w:eastAsiaTheme="minorEastAsia"/>
           <w:color w:val="000000" w:themeColor="text1"/>
         </w:rPr>
       </w:pPr>
@@ -679,6 +504,269 @@
             <m:fPr>
               <m:ctrlPr>
                 <w:rPr>
+                  <w:rFonts w:ascii="Cambria Math" w:eastAsiaTheme="minorEastAsia" w:hAnsi="Cambria Math" w:cstheme="minorHAnsi"/>
+                  <w:i/>
+                  <w:color w:val="000000" w:themeColor="text1"/>
+                </w:rPr>
+              </m:ctrlPr>
+            </m:fPr>
+            <m:num>
+              <m:r>
+                <w:rPr>
+                  <w:rFonts w:ascii="Cambria Math" w:eastAsiaTheme="minorEastAsia" w:hAnsi="Cambria Math" w:cstheme="minorHAnsi"/>
+                  <w:color w:val="000000" w:themeColor="text1"/>
+                </w:rPr>
+                <m:t>d</m:t>
+              </m:r>
+              <m:sSub>
+                <m:sSubPr>
+                  <m:ctrlPr>
+                    <w:rPr>
+                      <w:rFonts w:ascii="Cambria Math" w:eastAsiaTheme="minorEastAsia" w:hAnsi="Cambria Math" w:cstheme="minorHAnsi"/>
+                      <w:b/>
+                      <w:i/>
+                      <w:color w:val="000000" w:themeColor="text1"/>
+                    </w:rPr>
+                  </m:ctrlPr>
+                </m:sSubPr>
+                <m:e>
+                  <m:r>
+                    <m:rPr>
+                      <m:sty m:val="bi"/>
+                    </m:rPr>
+                    <w:rPr>
+                      <w:rFonts w:ascii="Cambria Math" w:eastAsiaTheme="minorEastAsia" w:hAnsi="Cambria Math" w:cstheme="minorHAnsi"/>
+                      <w:color w:val="000000" w:themeColor="text1"/>
+                    </w:rPr>
+                    <m:t>u</m:t>
+                  </m:r>
+                </m:e>
+                <m:sub>
+                  <m:r>
+                    <w:rPr>
+                      <w:rFonts w:ascii="Cambria Math" w:eastAsiaTheme="minorEastAsia" w:hAnsi="Cambria Math" w:cstheme="minorHAnsi"/>
+                      <w:color w:val="000000" w:themeColor="text1"/>
+                    </w:rPr>
+                    <m:t>d</m:t>
+                  </m:r>
+                </m:sub>
+              </m:sSub>
+            </m:num>
+            <m:den>
+              <m:r>
+                <w:rPr>
+                  <w:rFonts w:ascii="Cambria Math" w:eastAsiaTheme="minorEastAsia" w:hAnsi="Cambria Math" w:cstheme="minorHAnsi"/>
+                  <w:color w:val="000000" w:themeColor="text1"/>
+                </w:rPr>
+                <m:t>dt</m:t>
+              </m:r>
+            </m:den>
+          </m:f>
+          <m:r>
+            <w:rPr>
+              <w:rFonts w:ascii="Cambria Math" w:eastAsiaTheme="minorEastAsia" w:hAnsi="Cambria Math" w:cstheme="minorHAnsi"/>
+              <w:color w:val="000000" w:themeColor="text1"/>
+            </w:rPr>
+            <m:t>=</m:t>
+          </m:r>
+          <m:f>
+            <m:fPr>
+              <m:ctrlPr>
+                <w:rPr>
+                  <w:rFonts w:ascii="Cambria Math" w:eastAsiaTheme="minorEastAsia" w:hAnsi="Cambria Math" w:cstheme="minorHAnsi"/>
+                  <w:i/>
+                  <w:color w:val="000000" w:themeColor="text1"/>
+                </w:rPr>
+              </m:ctrlPr>
+            </m:fPr>
+            <m:num>
+              <m:r>
+                <w:rPr>
+                  <w:rFonts w:ascii="Cambria Math" w:eastAsiaTheme="minorEastAsia" w:hAnsi="Cambria Math" w:cstheme="minorHAnsi"/>
+                  <w:color w:val="000000" w:themeColor="text1"/>
+                </w:rPr>
+                <m:t>-</m:t>
+              </m:r>
+              <m:sSub>
+                <m:sSubPr>
+                  <m:ctrlPr>
+                    <w:rPr>
+                      <w:rFonts w:ascii="Cambria Math" w:eastAsiaTheme="minorEastAsia" w:hAnsi="Cambria Math" w:cstheme="minorHAnsi"/>
+                      <w:b/>
+                      <w:i/>
+                      <w:color w:val="000000" w:themeColor="text1"/>
+                    </w:rPr>
+                  </m:ctrlPr>
+                </m:sSubPr>
+                <m:e>
+                  <m:r>
+                    <m:rPr>
+                      <m:sty m:val="bi"/>
+                    </m:rPr>
+                    <w:rPr>
+                      <w:rFonts w:ascii="Cambria Math" w:eastAsiaTheme="minorEastAsia" w:hAnsi="Cambria Math" w:cstheme="minorHAnsi"/>
+                      <w:color w:val="000000" w:themeColor="text1"/>
+                    </w:rPr>
+                    <m:t>u</m:t>
+                  </m:r>
+                </m:e>
+                <m:sub>
+                  <m:r>
+                    <w:rPr>
+                      <w:rFonts w:ascii="Cambria Math" w:eastAsiaTheme="minorEastAsia" w:hAnsi="Cambria Math" w:cstheme="minorHAnsi"/>
+                      <w:color w:val="000000" w:themeColor="text1"/>
+                    </w:rPr>
+                    <m:t>d</m:t>
+                  </m:r>
+                </m:sub>
+              </m:sSub>
+              <m:r>
+                <w:rPr>
+                  <w:rFonts w:ascii="Cambria Math" w:eastAsiaTheme="minorEastAsia" w:hAnsi="Cambria Math" w:cstheme="minorHAnsi"/>
+                  <w:color w:val="000000" w:themeColor="text1"/>
+                </w:rPr>
+                <m:t>+</m:t>
+              </m:r>
+              <m:sSub>
+                <m:sSubPr>
+                  <m:ctrlPr>
+                    <w:rPr>
+                      <w:rFonts w:ascii="Cambria Math" w:eastAsiaTheme="minorEastAsia" w:hAnsi="Cambria Math" w:cstheme="minorHAnsi"/>
+                      <w:b/>
+                      <w:i/>
+                      <w:color w:val="000000" w:themeColor="text1"/>
+                    </w:rPr>
+                  </m:ctrlPr>
+                </m:sSubPr>
+                <m:e>
+                  <m:r>
+                    <m:rPr>
+                      <m:sty m:val="bi"/>
+                    </m:rPr>
+                    <w:rPr>
+                      <w:rFonts w:ascii="Cambria Math" w:eastAsiaTheme="minorEastAsia" w:hAnsi="Cambria Math" w:cstheme="minorHAnsi"/>
+                      <w:color w:val="000000" w:themeColor="text1"/>
+                    </w:rPr>
+                    <m:t>u</m:t>
+                  </m:r>
+                </m:e>
+                <m:sub>
+                  <m:r>
+                    <w:rPr>
+                      <w:rFonts w:ascii="Cambria Math" w:eastAsiaTheme="minorEastAsia" w:hAnsi="Cambria Math" w:cstheme="minorHAnsi"/>
+                      <w:color w:val="000000" w:themeColor="text1"/>
+                    </w:rPr>
+                    <m:t>ex</m:t>
+                  </m:r>
+                </m:sub>
+              </m:sSub>
+              <m:r>
+                <w:rPr>
+                  <w:rFonts w:ascii="Cambria Math" w:eastAsiaTheme="minorEastAsia" w:hAnsi="Cambria Math" w:cstheme="minorHAnsi"/>
+                  <w:color w:val="000000" w:themeColor="text1"/>
+                </w:rPr>
+                <m:t xml:space="preserve">+ </m:t>
+              </m:r>
+              <m:r>
+                <m:rPr>
+                  <m:sty m:val="bi"/>
+                </m:rPr>
+                <w:rPr>
+                  <w:rFonts w:ascii="Cambria Math" w:eastAsiaTheme="minorEastAsia" w:hAnsi="Cambria Math" w:cstheme="minorHAnsi"/>
+                  <w:color w:val="000000" w:themeColor="text1"/>
+                </w:rPr>
+                <m:t>M*</m:t>
+              </m:r>
+              <m:d>
+                <m:dPr>
+                  <m:ctrlPr>
+                    <w:rPr>
+                      <w:rFonts w:ascii="Cambria Math" w:eastAsiaTheme="minorEastAsia" w:hAnsi="Cambria Math"/>
+                      <w:b/>
+                      <w:i/>
+                      <w:color w:val="000000" w:themeColor="text1"/>
+                    </w:rPr>
+                  </m:ctrlPr>
+                </m:dPr>
+                <m:e>
+                  <m:r>
+                    <m:rPr>
+                      <m:sty m:val="bi"/>
+                    </m:rPr>
+                    <w:rPr>
+                      <w:rFonts w:ascii="Cambria Math" w:eastAsiaTheme="minorEastAsia" w:hAnsi="Cambria Math"/>
+                      <w:color w:val="000000" w:themeColor="text1"/>
+                    </w:rPr>
+                    <m:t>b∘r</m:t>
+                  </m:r>
+                </m:e>
+              </m:d>
+            </m:num>
+            <m:den>
+              <m:sSub>
+                <m:sSubPr>
+                  <m:ctrlPr>
+                    <w:rPr>
+                      <w:rFonts w:ascii="Cambria Math" w:eastAsiaTheme="minorEastAsia" w:hAnsi="Cambria Math" w:cstheme="minorHAnsi"/>
+                      <w:i/>
+                      <w:color w:val="000000" w:themeColor="text1"/>
+                    </w:rPr>
+                  </m:ctrlPr>
+                </m:sSubPr>
+                <m:e>
+                  <m:r>
+                    <w:rPr>
+                      <w:rFonts w:ascii="Cambria Math" w:eastAsiaTheme="minorEastAsia" w:hAnsi="Cambria Math" w:cstheme="minorHAnsi"/>
+                      <w:color w:val="000000" w:themeColor="text1"/>
+                    </w:rPr>
+                    <m:t>τ</m:t>
+                  </m:r>
+                </m:e>
+                <m:sub>
+                  <m:r>
+                    <w:rPr>
+                      <w:rFonts w:ascii="Cambria Math" w:eastAsiaTheme="minorEastAsia" w:hAnsi="Cambria Math" w:cstheme="minorHAnsi"/>
+                      <w:color w:val="000000" w:themeColor="text1"/>
+                    </w:rPr>
+                    <m:t>d</m:t>
+                  </m:r>
+                </m:sub>
+              </m:sSub>
+            </m:den>
+          </m:f>
+        </m:oMath>
+      </m:oMathPara>
+    </w:p>
+    <w:p>
+      <w:pPr>
+        <w:jc w:val="right"/>
+        <w:rPr>
+          <w:rFonts w:eastAsiaTheme="minorEastAsia"/>
+          <w:color w:val="000000" w:themeColor="text1"/>
+        </w:rPr>
+      </w:pPr>
+      <w:r>
+        <w:rPr>
+          <w:rFonts w:eastAsiaTheme="minorEastAsia"/>
+          <w:color w:val="000000" w:themeColor="text1"/>
+        </w:rPr>
+        <w:t>3</w:t>
+      </w:r>
+    </w:p>
+    <w:p>
+      <w:pPr>
+        <w:rPr>
+          <w:rFonts w:eastAsiaTheme="minorEastAsia"/>
+          <w:b/>
+          <w:color w:val="000000" w:themeColor="text1"/>
+        </w:rPr>
+      </w:pPr>
+      <m:oMathPara>
+        <m:oMath>
+          <m:f>
+            <m:fPr>
+              <m:ctrlPr>
+                <w:rPr>
                   <w:rFonts w:ascii="Cambria Math" w:eastAsiaTheme="minorEastAsia" w:hAnsi="Cambria Math"/>
                   <w:b/>
                   <w:bCs/>
@@ -697,39 +785,16 @@
                 </w:rPr>
                 <m:t>d</m:t>
               </m:r>
-              <m:sSub>
-                <m:sSubPr>
-                  <m:ctrlPr>
-                    <w:rPr>
-                      <w:rFonts w:ascii="Cambria Math" w:eastAsiaTheme="minorEastAsia" w:hAnsi="Cambria Math"/>
-                      <w:b/>
-                      <w:i/>
-                      <w:color w:val="000000" w:themeColor="text1"/>
-                    </w:rPr>
-                  </m:ctrlPr>
-                </m:sSubPr>
-                <m:e>
-                  <m:r>
-                    <m:rPr>
-                      <m:sty m:val="bi"/>
-                    </m:rPr>
-                    <w:rPr>
-                      <w:rFonts w:ascii="Cambria Math" w:eastAsiaTheme="minorEastAsia" w:hAnsi="Cambria Math"/>
-                      <w:color w:val="000000" w:themeColor="text1"/>
-                    </w:rPr>
-                    <m:t>b</m:t>
-                  </m:r>
-                </m:e>
-                <m:sub>
-                  <m:r>
-                    <w:rPr>
-                      <w:rFonts w:ascii="Cambria Math" w:eastAsiaTheme="minorEastAsia" w:hAnsi="Cambria Math"/>
-                      <w:color w:val="000000" w:themeColor="text1"/>
-                    </w:rPr>
-                    <m:t>m</m:t>
-                  </m:r>
-                </m:sub>
-              </m:sSub>
+              <m:r>
+                <m:rPr>
+                  <m:sty m:val="bi"/>
+                </m:rPr>
+                <w:rPr>
+                  <w:rFonts w:ascii="Cambria Math" w:eastAsiaTheme="minorEastAsia" w:hAnsi="Cambria Math"/>
+                  <w:color w:val="000000" w:themeColor="text1"/>
+                </w:rPr>
+                <m:t>b</m:t>
+              </m:r>
             </m:num>
             <m:den>
               <m:r>
@@ -777,41 +842,8 @@
                   <w:rFonts w:ascii="Cambria Math" w:eastAsiaTheme="minorEastAsia" w:hAnsi="Cambria Math"/>
                   <w:color w:val="000000" w:themeColor="text1"/>
                 </w:rPr>
-                <m:t>-</m:t>
+                <m:t>-b</m:t>
               </m:r>
-              <m:sSub>
-                <m:sSubPr>
-                  <m:ctrlPr>
-                    <w:rPr>
-                      <w:rFonts w:ascii="Cambria Math" w:eastAsiaTheme="minorEastAsia" w:hAnsi="Cambria Math"/>
-                      <w:b/>
-                      <w:i/>
-                      <w:color w:val="000000" w:themeColor="text1"/>
-                    </w:rPr>
-                  </m:ctrlPr>
-                </m:sSubPr>
-                <m:e>
-                  <m:r>
-                    <m:rPr>
-                      <m:sty m:val="bi"/>
-                    </m:rPr>
-                    <w:rPr>
-                      <w:rFonts w:ascii="Cambria Math" w:eastAsiaTheme="minorEastAsia" w:hAnsi="Cambria Math"/>
-                      <w:color w:val="000000" w:themeColor="text1"/>
-                    </w:rPr>
-                    <m:t>b</m:t>
-                  </m:r>
-                </m:e>
-                <m:sub>
-                  <m:r>
-                    <w:rPr>
-                      <w:rFonts w:ascii="Cambria Math" w:eastAsiaTheme="minorEastAsia" w:hAnsi="Cambria Math"/>
-                      <w:color w:val="000000" w:themeColor="text1"/>
-                    </w:rPr>
-                    <m:t>m</m:t>
-                  </m:r>
-                </m:sub>
-              </m:sSub>
             </m:num>
             <m:den>
               <m:sSub>
@@ -826,9 +858,6 @@
                 </m:sSubPr>
                 <m:e>
                   <m:r>
-                    <m:rPr>
-                      <m:sty m:val="bi"/>
-                    </m:rPr>
                     <w:rPr>
                       <w:rFonts w:ascii="Cambria Math" w:eastAsiaTheme="minorEastAsia" w:hAnsi="Cambria Math"/>
                       <w:color w:val="000000" w:themeColor="text1"/>
@@ -837,36 +866,13 @@
                   </m:r>
                 </m:e>
                 <m:sub>
-                  <m:sSub>
-                    <m:sSubPr>
-                      <m:ctrlPr>
-                        <w:rPr>
-                          <w:rFonts w:ascii="Cambria Math" w:eastAsiaTheme="minorEastAsia" w:hAnsi="Cambria Math"/>
-                          <w:b/>
-                          <w:i/>
-                          <w:color w:val="000000" w:themeColor="text1"/>
-                        </w:rPr>
-                      </m:ctrlPr>
-                    </m:sSubPr>
-                    <m:e>
-                      <m:r>
-                        <w:rPr>
-                          <w:rFonts w:ascii="Cambria Math" w:eastAsiaTheme="minorEastAsia" w:hAnsi="Cambria Math"/>
-                          <w:color w:val="000000" w:themeColor="text1"/>
-                        </w:rPr>
-                        <m:t>b</m:t>
-                      </m:r>
-                    </m:e>
-                    <m:sub>
-                      <m:r>
-                        <w:rPr>
-                          <w:rFonts w:ascii="Cambria Math" w:eastAsiaTheme="minorEastAsia" w:hAnsi="Cambria Math"/>
-                          <w:color w:val="000000" w:themeColor="text1"/>
-                        </w:rPr>
-                        <m:t>m</m:t>
-                      </m:r>
-                    </m:sub>
-                  </m:sSub>
+                  <m:r>
+                    <w:rPr>
+                      <w:rFonts w:ascii="Cambria Math" w:eastAsiaTheme="minorEastAsia" w:hAnsi="Cambria Math"/>
+                      <w:color w:val="000000" w:themeColor="text1"/>
+                    </w:rPr>
+                    <m:t>b</m:t>
+                  </m:r>
                 </m:sub>
               </m:sSub>
             </m:den>
@@ -897,10 +903,30 @@
                   <m:sty m:val="bi"/>
                 </m:rPr>
                 <w:rPr>
-                  <w:rFonts w:ascii="Cambria Math" w:eastAsiaTheme="minorEastAsia" w:hAnsi="Cambria Math" w:cstheme="minorHAnsi"/>
-                  <w:color w:val="000000" w:themeColor="text1"/>
-                </w:rPr>
-                <m:t>p</m:t>
+                  <w:rFonts w:ascii="Cambria Math" w:eastAsiaTheme="minorEastAsia" w:hAnsi="Cambria Math"/>
+                  <w:color w:val="000000" w:themeColor="text1"/>
+                </w:rPr>
+                <m:t>b</m:t>
+              </m:r>
+              <m:r>
+                <m:rPr>
+                  <m:sty m:val="bi"/>
+                </m:rPr>
+                <w:rPr>
+                  <w:rFonts w:ascii="Cambria Math" w:eastAsiaTheme="minorEastAsia" w:hAnsi="Cambria Math"/>
+                  <w:color w:val="000000" w:themeColor="text1"/>
+                </w:rPr>
+                <m:t>∘</m:t>
+              </m:r>
+              <m:r>
+                <m:rPr>
+                  <m:sty m:val="bi"/>
+                </m:rPr>
+                <w:rPr>
+                  <w:rFonts w:ascii="Cambria Math" w:eastAsiaTheme="minorEastAsia" w:hAnsi="Cambria Math"/>
+                  <w:color w:val="000000" w:themeColor="text1"/>
+                </w:rPr>
+                <m:t>r</m:t>
               </m:r>
             </m:num>
             <m:den>
@@ -945,158 +971,19 @@
       <w:pPr>
         <w:jc w:val="right"/>
         <w:rPr>
-          <w:rFonts w:eastAsiaTheme="minorEastAsia" w:cstheme="minorHAnsi"/>
-          <w:color w:val="000000" w:themeColor="text1"/>
-        </w:rPr>
-      </w:pPr>
-      <m:oMathPara>
-        <m:oMath>
-          <m:r>
-            <w:rPr>
-              <w:rFonts w:ascii="Cambria Math" w:eastAsiaTheme="minorEastAsia" w:hAnsi="Cambria Math"/>
-              <w:color w:val="000000" w:themeColor="text1"/>
-            </w:rPr>
-            <m:t>0</m:t>
-          </m:r>
-          <m:r>
-            <m:rPr>
-              <m:sty m:val="bi"/>
-            </m:rPr>
-            <w:rPr>
-              <w:rFonts w:ascii="Cambria Math" w:eastAsiaTheme="minorEastAsia" w:hAnsi="Cambria Math"/>
-              <w:color w:val="000000" w:themeColor="text1"/>
-            </w:rPr>
-            <m:t>≤</m:t>
-          </m:r>
-          <m:sSub>
-            <m:sSubPr>
-              <m:ctrlPr>
-                <w:rPr>
-                  <w:rFonts w:ascii="Cambria Math" w:eastAsiaTheme="minorEastAsia" w:hAnsi="Cambria Math"/>
-                  <w:b/>
-                  <w:i/>
-                  <w:color w:val="000000" w:themeColor="text1"/>
-                </w:rPr>
-              </m:ctrlPr>
-            </m:sSubPr>
-            <m:e>
-              <m:r>
-                <m:rPr>
-                  <m:sty m:val="bi"/>
-                </m:rPr>
-                <w:rPr>
-                  <w:rFonts w:ascii="Cambria Math" w:eastAsiaTheme="minorEastAsia" w:hAnsi="Cambria Math"/>
-                  <w:color w:val="000000" w:themeColor="text1"/>
-                </w:rPr>
-                <m:t>b</m:t>
-              </m:r>
-            </m:e>
-            <m:sub>
-              <m:r>
-                <w:rPr>
-                  <w:rFonts w:ascii="Cambria Math" w:eastAsiaTheme="minorEastAsia" w:hAnsi="Cambria Math"/>
-                  <w:color w:val="000000" w:themeColor="text1"/>
-                </w:rPr>
-                <m:t>m</m:t>
-              </m:r>
-            </m:sub>
-          </m:sSub>
-          <m:r>
-            <m:rPr>
-              <m:sty m:val="bi"/>
-            </m:rPr>
-            <w:rPr>
-              <w:rFonts w:ascii="Cambria Math" w:eastAsiaTheme="minorEastAsia" w:hAnsi="Cambria Math"/>
-              <w:color w:val="000000" w:themeColor="text1"/>
-            </w:rPr>
-            <m:t>≤</m:t>
-          </m:r>
-          <m:r>
-            <w:rPr>
-              <w:rFonts w:ascii="Cambria Math" w:eastAsiaTheme="minorEastAsia" w:hAnsi="Cambria Math"/>
-              <w:color w:val="000000" w:themeColor="text1"/>
-            </w:rPr>
-            <m:t>1</m:t>
-          </m:r>
-        </m:oMath>
-      </m:oMathPara>
-    </w:p>
-    <w:p>
-      <w:pPr>
-        <w:jc w:val="right"/>
-        <w:rPr>
-          <w:rFonts w:eastAsiaTheme="minorEastAsia" w:cstheme="minorHAnsi"/>
-          <w:color w:val="000000" w:themeColor="text1"/>
-        </w:rPr>
-      </w:pPr>
-      <m:oMathPara>
-        <m:oMath>
-          <m:sSub>
-            <m:sSubPr>
-              <m:ctrlPr>
-                <w:rPr>
-                  <w:rFonts w:ascii="Cambria Math" w:eastAsiaTheme="minorEastAsia" w:hAnsi="Cambria Math"/>
-                  <w:i/>
-                  <w:color w:val="000000" w:themeColor="text1"/>
-                </w:rPr>
-              </m:ctrlPr>
-            </m:sSubPr>
-            <m:e>
-              <m:r>
-                <m:rPr>
-                  <m:sty m:val="bi"/>
-                </m:rPr>
-                <w:rPr>
-                  <w:rFonts w:ascii="Cambria Math" w:eastAsiaTheme="minorEastAsia" w:hAnsi="Cambria Math"/>
-                  <w:color w:val="000000" w:themeColor="text1"/>
-                </w:rPr>
-                <m:t>F</m:t>
-              </m:r>
-            </m:e>
-            <m:sub>
-              <m:r>
-                <w:rPr>
-                  <w:rFonts w:ascii="Cambria Math" w:eastAsiaTheme="minorEastAsia" w:hAnsi="Cambria Math"/>
-                  <w:color w:val="000000" w:themeColor="text1"/>
-                </w:rPr>
-                <m:t>STD</m:t>
-              </m:r>
-            </m:sub>
-          </m:sSub>
-          <m:r>
-            <w:rPr>
-              <w:rFonts w:ascii="Cambria Math" w:eastAsiaTheme="minorEastAsia" w:hAnsi="Cambria Math"/>
-              <w:color w:val="000000" w:themeColor="text1"/>
-            </w:rPr>
-            <m:t>∈{0, 1}</m:t>
-          </m:r>
-        </m:oMath>
-      </m:oMathPara>
-    </w:p>
-    <w:p>
-      <w:pPr>
-        <w:jc w:val="right"/>
-        <w:rPr>
-          <w:rFonts w:eastAsiaTheme="minorEastAsia" w:cstheme="minorHAnsi"/>
+          <w:rFonts w:eastAsiaTheme="minorEastAsia"/>
+          <w:bCs/>
           <w:color w:val="000000" w:themeColor="text1"/>
         </w:rPr>
       </w:pPr>
       <w:r>
         <w:rPr>
-          <w:rFonts w:eastAsiaTheme="minorEastAsia" w:cstheme="minorHAnsi"/>
+          <w:rFonts w:eastAsiaTheme="minorEastAsia"/>
+          <w:bCs/>
           <w:color w:val="000000" w:themeColor="text1"/>
         </w:rPr>
         <w:t>4</w:t>
       </w:r>
-    </w:p>
-    <w:p>
-      <w:pPr>
-        <w:jc w:val="right"/>
-        <w:rPr>
-          <w:rFonts w:eastAsiaTheme="minorEastAsia" w:cstheme="minorHAnsi"/>
-          <w:color w:val="000000" w:themeColor="text1"/>
-        </w:rPr>
-      </w:pPr>
     </w:p>
     <w:p>
       <w:pPr>
@@ -1107,254 +994,6 @@
           <w:color w:val="000000" w:themeColor="text1"/>
         </w:rPr>
       </w:pPr>
-      <m:oMathPara>
-        <m:oMath>
-          <m:f>
-            <m:fPr>
-              <m:ctrlPr>
-                <w:rPr>
-                  <w:rFonts w:ascii="Cambria Math" w:eastAsiaTheme="minorEastAsia" w:hAnsi="Cambria Math" w:cstheme="minorHAnsi"/>
-                  <w:i/>
-                  <w:color w:val="000000" w:themeColor="text1"/>
-                </w:rPr>
-              </m:ctrlPr>
-            </m:fPr>
-            <m:num>
-              <m:r>
-                <w:rPr>
-                  <w:rFonts w:ascii="Cambria Math" w:eastAsiaTheme="minorEastAsia" w:hAnsi="Cambria Math" w:cstheme="minorHAnsi"/>
-                  <w:color w:val="000000" w:themeColor="text1"/>
-                </w:rPr>
-                <m:t>d</m:t>
-              </m:r>
-              <m:sSub>
-                <m:sSubPr>
-                  <m:ctrlPr>
-                    <w:rPr>
-                      <w:rFonts w:ascii="Cambria Math" w:eastAsiaTheme="minorEastAsia" w:hAnsi="Cambria Math" w:cstheme="minorHAnsi"/>
-                      <w:b/>
-                      <w:i/>
-                      <w:color w:val="000000" w:themeColor="text1"/>
-                    </w:rPr>
-                  </m:ctrlPr>
-                </m:sSubPr>
-                <m:e>
-                  <m:r>
-                    <m:rPr>
-                      <m:sty m:val="bi"/>
-                    </m:rPr>
-                    <w:rPr>
-                      <w:rFonts w:ascii="Cambria Math" w:eastAsiaTheme="minorEastAsia" w:hAnsi="Cambria Math" w:cstheme="minorHAnsi"/>
-                      <w:color w:val="000000" w:themeColor="text1"/>
-                    </w:rPr>
-                    <m:t>u</m:t>
-                  </m:r>
-                </m:e>
-                <m:sub>
-                  <m:r>
-                    <w:rPr>
-                      <w:rFonts w:ascii="Cambria Math" w:eastAsiaTheme="minorEastAsia" w:hAnsi="Cambria Math" w:cstheme="minorHAnsi"/>
-                      <w:color w:val="000000" w:themeColor="text1"/>
-                    </w:rPr>
-                    <m:t>d</m:t>
-                  </m:r>
-                </m:sub>
-              </m:sSub>
-            </m:num>
-            <m:den>
-              <m:r>
-                <w:rPr>
-                  <w:rFonts w:ascii="Cambria Math" w:eastAsiaTheme="minorEastAsia" w:hAnsi="Cambria Math" w:cstheme="minorHAnsi"/>
-                  <w:color w:val="000000" w:themeColor="text1"/>
-                </w:rPr>
-                <m:t>dt</m:t>
-              </m:r>
-            </m:den>
-          </m:f>
-          <m:r>
-            <w:rPr>
-              <w:rFonts w:ascii="Cambria Math" w:eastAsiaTheme="minorEastAsia" w:hAnsi="Cambria Math" w:cstheme="minorHAnsi"/>
-              <w:color w:val="000000" w:themeColor="text1"/>
-            </w:rPr>
-            <m:t>=</m:t>
-          </m:r>
-          <m:f>
-            <m:fPr>
-              <m:ctrlPr>
-                <w:rPr>
-                  <w:rFonts w:ascii="Cambria Math" w:eastAsiaTheme="minorEastAsia" w:hAnsi="Cambria Math" w:cstheme="minorHAnsi"/>
-                  <w:i/>
-                  <w:color w:val="000000" w:themeColor="text1"/>
-                </w:rPr>
-              </m:ctrlPr>
-            </m:fPr>
-            <m:num>
-              <m:r>
-                <w:rPr>
-                  <w:rFonts w:ascii="Cambria Math" w:eastAsiaTheme="minorEastAsia" w:hAnsi="Cambria Math" w:cstheme="minorHAnsi"/>
-                  <w:color w:val="000000" w:themeColor="text1"/>
-                </w:rPr>
-                <m:t>-</m:t>
-              </m:r>
-              <m:sSub>
-                <m:sSubPr>
-                  <m:ctrlPr>
-                    <w:rPr>
-                      <w:rFonts w:ascii="Cambria Math" w:eastAsiaTheme="minorEastAsia" w:hAnsi="Cambria Math" w:cstheme="minorHAnsi"/>
-                      <w:b/>
-                      <w:i/>
-                      <w:color w:val="000000" w:themeColor="text1"/>
-                    </w:rPr>
-                  </m:ctrlPr>
-                </m:sSubPr>
-                <m:e>
-                  <m:r>
-                    <m:rPr>
-                      <m:sty m:val="bi"/>
-                    </m:rPr>
-                    <w:rPr>
-                      <w:rFonts w:ascii="Cambria Math" w:eastAsiaTheme="minorEastAsia" w:hAnsi="Cambria Math" w:cstheme="minorHAnsi"/>
-                      <w:color w:val="000000" w:themeColor="text1"/>
-                    </w:rPr>
-                    <m:t>u</m:t>
-                  </m:r>
-                </m:e>
-                <m:sub>
-                  <m:r>
-                    <w:rPr>
-                      <w:rFonts w:ascii="Cambria Math" w:eastAsiaTheme="minorEastAsia" w:hAnsi="Cambria Math" w:cstheme="minorHAnsi"/>
-                      <w:color w:val="000000" w:themeColor="text1"/>
-                    </w:rPr>
-                    <m:t>d</m:t>
-                  </m:r>
-                </m:sub>
-              </m:sSub>
-              <m:r>
-                <w:rPr>
-                  <w:rFonts w:ascii="Cambria Math" w:eastAsiaTheme="minorEastAsia" w:hAnsi="Cambria Math" w:cstheme="minorHAnsi"/>
-                  <w:color w:val="000000" w:themeColor="text1"/>
-                </w:rPr>
-                <m:t>+</m:t>
-              </m:r>
-              <m:sSub>
-                <m:sSubPr>
-                  <m:ctrlPr>
-                    <w:rPr>
-                      <w:rFonts w:ascii="Cambria Math" w:eastAsiaTheme="minorEastAsia" w:hAnsi="Cambria Math" w:cstheme="minorHAnsi"/>
-                      <w:b/>
-                      <w:i/>
-                      <w:color w:val="000000" w:themeColor="text1"/>
-                    </w:rPr>
-                  </m:ctrlPr>
-                </m:sSubPr>
-                <m:e>
-                  <m:r>
-                    <m:rPr>
-                      <m:sty m:val="bi"/>
-                    </m:rPr>
-                    <w:rPr>
-                      <w:rFonts w:ascii="Cambria Math" w:eastAsiaTheme="minorEastAsia" w:hAnsi="Cambria Math" w:cstheme="minorHAnsi"/>
-                      <w:color w:val="000000" w:themeColor="text1"/>
-                    </w:rPr>
-                    <m:t>u</m:t>
-                  </m:r>
-                </m:e>
-                <m:sub>
-                  <m:r>
-                    <w:rPr>
-                      <w:rFonts w:ascii="Cambria Math" w:eastAsiaTheme="minorEastAsia" w:hAnsi="Cambria Math" w:cstheme="minorHAnsi"/>
-                      <w:color w:val="000000" w:themeColor="text1"/>
-                    </w:rPr>
-                    <m:t>ex</m:t>
-                  </m:r>
-                </m:sub>
-              </m:sSub>
-              <m:r>
-                <w:rPr>
-                  <w:rFonts w:ascii="Cambria Math" w:eastAsiaTheme="minorEastAsia" w:hAnsi="Cambria Math" w:cstheme="minorHAnsi"/>
-                  <w:color w:val="000000" w:themeColor="text1"/>
-                </w:rPr>
-                <m:t xml:space="preserve">+ </m:t>
-              </m:r>
-              <m:r>
-                <m:rPr>
-                  <m:sty m:val="bi"/>
-                </m:rPr>
-                <w:rPr>
-                  <w:rFonts w:ascii="Cambria Math" w:eastAsiaTheme="minorEastAsia" w:hAnsi="Cambria Math" w:cstheme="minorHAnsi"/>
-                  <w:color w:val="000000" w:themeColor="text1"/>
-                </w:rPr>
-                <m:t>M</m:t>
-              </m:r>
-              <m:r>
-                <w:rPr>
-                  <w:rFonts w:ascii="Cambria Math" w:eastAsiaTheme="minorEastAsia" w:hAnsi="Cambria Math" w:cstheme="minorHAnsi"/>
-                  <w:color w:val="000000" w:themeColor="text1"/>
-                </w:rPr>
-                <m:t>*</m:t>
-              </m:r>
-              <m:r>
-                <m:rPr>
-                  <m:sty m:val="bi"/>
-                </m:rPr>
-                <w:rPr>
-                  <w:rFonts w:ascii="Cambria Math" w:eastAsiaTheme="minorEastAsia" w:hAnsi="Cambria Math" w:cstheme="minorHAnsi"/>
-                  <w:color w:val="000000" w:themeColor="text1"/>
-                </w:rPr>
-                <m:t>p</m:t>
-              </m:r>
-            </m:num>
-            <m:den>
-              <m:sSub>
-                <m:sSubPr>
-                  <m:ctrlPr>
-                    <w:rPr>
-                      <w:rFonts w:ascii="Cambria Math" w:eastAsiaTheme="minorEastAsia" w:hAnsi="Cambria Math" w:cstheme="minorHAnsi"/>
-                      <w:i/>
-                      <w:color w:val="000000" w:themeColor="text1"/>
-                    </w:rPr>
-                  </m:ctrlPr>
-                </m:sSubPr>
-                <m:e>
-                  <m:r>
-                    <w:rPr>
-                      <w:rFonts w:ascii="Cambria Math" w:eastAsiaTheme="minorEastAsia" w:hAnsi="Cambria Math" w:cstheme="minorHAnsi"/>
-                      <w:color w:val="000000" w:themeColor="text1"/>
-                    </w:rPr>
-                    <m:t>τ</m:t>
-                  </m:r>
-                </m:e>
-                <m:sub>
-                  <m:r>
-                    <w:rPr>
-                      <w:rFonts w:ascii="Cambria Math" w:eastAsiaTheme="minorEastAsia" w:hAnsi="Cambria Math" w:cstheme="minorHAnsi"/>
-                      <w:color w:val="000000" w:themeColor="text1"/>
-                    </w:rPr>
-                    <m:t>d</m:t>
-                  </m:r>
-                </m:sub>
-              </m:sSub>
-            </m:den>
-          </m:f>
-        </m:oMath>
-      </m:oMathPara>
-    </w:p>
-    <w:p>
-      <w:pPr>
-        <w:jc w:val="right"/>
-        <w:rPr>
-          <w:rFonts w:eastAsiaTheme="minorEastAsia"/>
-          <w:b/>
-          <w:color w:val="000000" w:themeColor="text1"/>
-        </w:rPr>
-      </w:pPr>
-      <w:r>
-        <w:rPr>
-          <w:rFonts w:eastAsiaTheme="minorEastAsia" w:cstheme="minorHAnsi"/>
-          <w:color w:val="000000" w:themeColor="text1"/>
-        </w:rPr>
-        <w:t>5</w:t>
-      </w:r>
     </w:p>
     <w:p>
       <w:pPr>

</xml_diff>